<commit_message>
[DOC] - update sprint 1 project documentation
</commit_message>
<xml_diff>
--- a/docs/adrs/word/ADR-0006.docx
+++ b/docs/adrs/word/ADR-0006.docx
@@ -36,7 +36,7 @@
           <w:noProof/>
         </w:rPr>
         <w:drawing>
-          <wp:inline distT="0" distB="0" distL="0" distR="0" wp14:anchorId="2CC25406" wp14:editId="7A56E5C7">
+          <wp:inline distT="0" distB="0" distL="0" distR="0" wp14:anchorId="2CC25406" wp14:editId="5E27B88A">
             <wp:extent cx="5400040" cy="3980180"/>
             <wp:effectExtent l="0" t="0" r="0" b="0"/>
             <wp:docPr id="1953506445" name="Imagen 1" descr="Identidad corporativa - Universidad de Oviedo - uniovi.es"/>
@@ -101,13 +101,11 @@
       </w:r>
       <w:proofErr w:type="spellEnd"/>
       <w:r>
-        <w:t xml:space="preserve"> token en cookie </w:t>
-      </w:r>
-      <w:proofErr w:type="spellStart"/>
-      <w:r>
-        <w:t>httpOnly</w:t>
-      </w:r>
-      <w:proofErr w:type="spellEnd"/>
+        <w:t xml:space="preserve"> token </w:t>
+      </w:r>
+      <w:r>
+        <w:t>y sesión persistida</w:t>
+      </w:r>
     </w:p>
     <w:p>
       <w:pPr>
@@ -153,13 +151,8 @@
       <w:r>
         <w:t xml:space="preserve"> </w:t>
       </w:r>
-      <w:proofErr w:type="spellStart"/>
-      <w:r>
-        <w:t>Proposed</w:t>
-      </w:r>
-      <w:proofErr w:type="spellEnd"/>
-      <w:r>
-        <w:t xml:space="preserve"> (pendiente de validación por el tutor)</w:t>
+      <w:r>
+        <w:t>Accepted</w:t>
       </w:r>
     </w:p>
     <w:p>
@@ -196,45 +189,24 @@
         <w:pStyle w:val="ListaCheckList"/>
       </w:pPr>
       <w:r>
-        <w:t xml:space="preserve">☐ </w:t>
-      </w:r>
-      <w:proofErr w:type="spellStart"/>
-      <w:r>
-        <w:t>Proposed</w:t>
-      </w:r>
-      <w:proofErr w:type="spellEnd"/>
+        <w:t>☐ Proposed</w:t>
+      </w:r>
     </w:p>
     <w:p>
       <w:pPr>
         <w:pStyle w:val="ListaCheckList"/>
       </w:pPr>
       <w:r>
-        <w:t>☒</w:t>
-      </w:r>
-      <w:r>
-        <w:t xml:space="preserve"> </w:t>
-      </w:r>
-      <w:proofErr w:type="spellStart"/>
-      <w:r>
-        <w:t>Accepted</w:t>
-      </w:r>
-      <w:proofErr w:type="spellEnd"/>
+        <w:t>☒ Accepted</w:t>
+      </w:r>
     </w:p>
     <w:p>
       <w:pPr>
         <w:pStyle w:val="ListaCheckList"/>
       </w:pPr>
       <w:r>
-        <w:t>☐</w:t>
-      </w:r>
-      <w:r>
-        <w:t xml:space="preserve"> </w:t>
-      </w:r>
-      <w:proofErr w:type="spellStart"/>
-      <w:r>
-        <w:t>Superseded</w:t>
-      </w:r>
-      <w:proofErr w:type="spellEnd"/>
+        <w:t>☐ Superseded</w:t>
+      </w:r>
     </w:p>
     <w:p>
       <w:pPr>

</xml_diff>